<commit_message>
Match test plan timecodes to the final demo video
The 3.1 operation-test timecodes came from the storyboard; the delivered
video runs 4:24, so every entry was 10–30 s late. Update the 13 timecodes
and the 4.4 deliverable line (file name, 264 s) to the final cut.

Co-Authored-By: Claude Opus 5 <noreply@anthropic.com>
Claude-Session: https://claude.ai/code/session_01WSDZWTRjRFKBz7vTU1zpQR
</commit_message>
<xml_diff>
--- a/大四上第一次簡報/閃騙俠_測試計畫書.docx
+++ b/大四上第一次簡報/閃騙俠_測試計畫書.docx
@@ -1928,7 +1928,7 @@
               <w:rPr>
                 <w:sz w:val="19"/>
               </w:rPr>
-              <w:t>00:14</w:t>
+              <w:t>00:13</w:t>
             </w:r>
           </w:p>
         </w:tc>
@@ -2080,7 +2080,7 @@
               <w:rPr>
                 <w:sz w:val="19"/>
               </w:rPr>
-              <w:t>00:27</w:t>
+              <w:t>00:21</w:t>
             </w:r>
           </w:p>
         </w:tc>
@@ -2201,7 +2201,7 @@
               <w:rPr>
                 <w:sz w:val="19"/>
               </w:rPr>
-              <w:t>00:33</w:t>
+              <w:t>00:26</w:t>
             </w:r>
           </w:p>
         </w:tc>
@@ -2345,7 +2345,7 @@
               <w:rPr>
                 <w:sz w:val="19"/>
               </w:rPr>
-              <w:t>00:37</w:t>
+              <w:t>00:31</w:t>
             </w:r>
           </w:p>
         </w:tc>
@@ -2510,7 +2510,7 @@
               <w:rPr>
                 <w:sz w:val="19"/>
               </w:rPr>
-              <w:t>00:54</w:t>
+              <w:t>00:46</w:t>
             </w:r>
           </w:p>
         </w:tc>
@@ -2656,7 +2656,7 @@
               <w:rPr>
                 <w:sz w:val="19"/>
               </w:rPr>
-              <w:t>01:17</w:t>
+              <w:t>01:07</w:t>
             </w:r>
           </w:p>
         </w:tc>
@@ -2781,7 +2781,7 @@
               <w:rPr>
                 <w:sz w:val="19"/>
               </w:rPr>
-              <w:t>01:52</w:t>
+              <w:t>01:40</w:t>
             </w:r>
           </w:p>
         </w:tc>
@@ -2943,7 +2943,7 @@
               <w:rPr>
                 <w:sz w:val="19"/>
               </w:rPr>
-              <w:t>02:12</w:t>
+              <w:t>01:57</w:t>
             </w:r>
           </w:p>
         </w:tc>
@@ -3092,7 +3092,7 @@
               <w:rPr>
                 <w:sz w:val="19"/>
               </w:rPr>
-              <w:t>02:38</w:t>
+              <w:t>02:21</w:t>
             </w:r>
           </w:p>
         </w:tc>
@@ -3253,7 +3253,7 @@
               <w:rPr>
                 <w:sz w:val="19"/>
               </w:rPr>
-              <w:t>03:10</w:t>
+              <w:t>02:46</w:t>
             </w:r>
           </w:p>
         </w:tc>
@@ -3378,7 +3378,7 @@
               <w:rPr>
                 <w:sz w:val="19"/>
               </w:rPr>
-              <w:t>03:38</w:t>
+              <w:t>03:09</w:t>
             </w:r>
           </w:p>
         </w:tc>
@@ -3546,7 +3546,7 @@
               <w:rPr>
                 <w:sz w:val="19"/>
               </w:rPr>
-              <w:t>04:01</w:t>
+              <w:t>03:30</w:t>
             </w:r>
           </w:p>
         </w:tc>
@@ -3694,7 +3694,7 @@
               <w:rPr>
                 <w:sz w:val="19"/>
               </w:rPr>
-              <w:t>04:20</w:t>
+              <w:t>03:48</w:t>
             </w:r>
           </w:p>
         </w:tc>
@@ -11493,7 +11493,7 @@
                 <w:sz w:val="20"/>
                 <w:lang w:eastAsia="zh-TW"/>
               </w:rPr>
-              <w:t>final.mp4（1920×1080、298 秒、有旁白與字幕）；</w:t>
+              <w:t>F.L.A.S.H._第三次專題報告_簡報影片.mp4（1920×1080、264 秒、有旁白與字幕）；</w:t>
             </w:r>
             <w:r>
               <w:rPr>

</xml_diff>